<commit_message>
actualizacion tipo de excel para importacion en memorias
</commit_message>
<xml_diff>
--- a/doc/Memoria final.docx
+++ b/doc/Memoria final.docx
@@ -1081,7 +1081,21 @@
                 <w:rStyle w:val="Hipervnculo"/>
                 <w:noProof/>
               </w:rPr>
-              <w:t>1.2 Descripción de la Solución Aportada</w:t>
+              <w:t>1.2 Descripció</w:t>
+            </w:r>
+            <w:r>
+              <w:rPr>
+                <w:rStyle w:val="Hipervnculo"/>
+                <w:noProof/>
+              </w:rPr>
+              <w:t>n</w:t>
+            </w:r>
+            <w:r>
+              <w:rPr>
+                <w:rStyle w:val="Hipervnculo"/>
+                <w:noProof/>
+              </w:rPr>
+              <w:t xml:space="preserve"> de la Solución Aportada</w:t>
             </w:r>
             <w:r>
               <w:rPr>
@@ -1501,7 +1515,21 @@
                 <w:rStyle w:val="Hipervnculo"/>
                 <w:noProof/>
               </w:rPr>
-              <w:t>3.1 Descripción Detallada de la Funcionalidad</w:t>
+              <w:t>3.1 Descr</w:t>
+            </w:r>
+            <w:r>
+              <w:rPr>
+                <w:rStyle w:val="Hipervnculo"/>
+                <w:noProof/>
+              </w:rPr>
+              <w:t>i</w:t>
+            </w:r>
+            <w:r>
+              <w:rPr>
+                <w:rStyle w:val="Hipervnculo"/>
+                <w:noProof/>
+              </w:rPr>
+              <w:t>pción Detallada de la Funcionalidad</w:t>
             </w:r>
             <w:r>
               <w:rPr>
@@ -2551,7 +2579,21 @@
                 <w:rStyle w:val="Hipervnculo"/>
                 <w:noProof/>
               </w:rPr>
-              <w:t>5.7 Importación y Exportación de Datos CSV</w:t>
+              <w:t>5.7 Impo</w:t>
+            </w:r>
+            <w:r>
+              <w:rPr>
+                <w:rStyle w:val="Hipervnculo"/>
+                <w:noProof/>
+              </w:rPr>
+              <w:t>r</w:t>
+            </w:r>
+            <w:r>
+              <w:rPr>
+                <w:rStyle w:val="Hipervnculo"/>
+                <w:noProof/>
+              </w:rPr>
+              <w:t>tación y Exportación de Datos CSV</w:t>
             </w:r>
             <w:r>
               <w:rPr>
@@ -2662,7 +2704,7 @@
                 <w:noProof/>
                 <w:webHidden/>
               </w:rPr>
-              <w:t>23</w:t>
+              <w:t>24</w:t>
             </w:r>
             <w:r>
               <w:rPr>
@@ -2732,7 +2774,7 @@
                 <w:noProof/>
                 <w:webHidden/>
               </w:rPr>
-              <w:t>23</w:t>
+              <w:t>24</w:t>
             </w:r>
             <w:r>
               <w:rPr>
@@ -2802,7 +2844,7 @@
                 <w:noProof/>
                 <w:webHidden/>
               </w:rPr>
-              <w:t>24</w:t>
+              <w:t>25</w:t>
             </w:r>
             <w:r>
               <w:rPr>
@@ -2872,7 +2914,7 @@
                 <w:noProof/>
                 <w:webHidden/>
               </w:rPr>
-              <w:t>24</w:t>
+              <w:t>25</w:t>
             </w:r>
             <w:r>
               <w:rPr>
@@ -2942,7 +2984,7 @@
                 <w:noProof/>
                 <w:webHidden/>
               </w:rPr>
-              <w:t>24</w:t>
+              <w:t>25</w:t>
             </w:r>
             <w:r>
               <w:rPr>
@@ -3012,7 +3054,7 @@
                 <w:noProof/>
                 <w:webHidden/>
               </w:rPr>
-              <w:t>26</w:t>
+              <w:t>27</w:t>
             </w:r>
             <w:r>
               <w:rPr>
@@ -3352,7 +3394,19 @@
         <w:rPr>
           <w:lang w:val="es-ES"/>
         </w:rPr>
-        <w:t>: Procesar extractos bancarios del BBVA en formato CSV, convirtiéndolos en un modelo de datos normalizado y comprensible.</w:t>
+        <w:t xml:space="preserve">: Procesar extractos </w:t>
+      </w:r>
+      <w:r>
+        <w:rPr>
+          <w:lang w:val="es-ES"/>
+        </w:rPr>
+        <w:t>bancarios en formato CSV genérico</w:t>
+      </w:r>
+      <w:r>
+        <w:rPr>
+          <w:lang w:val="es-ES"/>
+        </w:rPr>
+        <w:t>, convirtiéndolos en un modelo de datos normalizado y comprensible.</w:t>
       </w:r>
     </w:p>
     <w:p>
@@ -5312,14 +5366,19 @@
         <w:rPr>
           <w:lang w:val="es-ES"/>
         </w:rPr>
-        <w:t xml:space="preserve">Importar archivos CSV (formato BBVA con separador </w:t>
-      </w:r>
-      <w:r>
-        <w:rPr>
-          <w:rStyle w:val="VerbatimChar"/>
-          <w:lang w:val="es-ES"/>
-        </w:rPr>
-        <w:t>;</w:t>
+        <w:t>Importar archivos CSV (formato</w:t>
+      </w:r>
+      <w:r>
+        <w:rPr>
+          <w:lang w:val="es-ES"/>
+        </w:rPr>
+        <w:t xml:space="preserve"> </w:t>
+      </w:r>
+      <w:r>
+        <w:rPr>
+          <w:lang w:val="es-ES"/>
+        </w:rPr>
+        <w:t>genérico</w:t>
       </w:r>
       <w:r>
         <w:rPr>
@@ -5408,9 +5467,64 @@
       <w:proofErr w:type="spellEnd"/>
       <w:r>
         <w:rPr>
-          <w:lang w:val="es-ES"/>
-        </w:rPr>
-        <w:t xml:space="preserve"> → </w:t>
+          <w:rStyle w:val="VerbatimChar"/>
+          <w:lang w:val="es-ES"/>
+        </w:rPr>
+        <w:t xml:space="preserve"> </w:t>
+      </w:r>
+      <w:proofErr w:type="spellStart"/>
+      <w:r>
+        <w:rPr>
+          <w:rStyle w:val="VerbatimChar"/>
+          <w:lang w:val="es-ES"/>
+        </w:rPr>
+        <w:t>ó</w:t>
+      </w:r>
+      <w:proofErr w:type="spellEnd"/>
+      <w:r>
+        <w:rPr>
+          <w:rStyle w:val="VerbatimChar"/>
+          <w:lang w:val="es-ES"/>
+        </w:rPr>
+        <w:t xml:space="preserve"> </w:t>
+      </w:r>
+      <w:proofErr w:type="spellStart"/>
+      <w:r>
+        <w:rPr>
+          <w:rStyle w:val="VerbatimChar"/>
+          <w:lang w:val="es-ES"/>
+        </w:rPr>
+        <w:t>yyyy</w:t>
+      </w:r>
+      <w:proofErr w:type="spellEnd"/>
+      <w:r>
+        <w:rPr>
+          <w:rStyle w:val="VerbatimChar"/>
+          <w:lang w:val="es-ES"/>
+        </w:rPr>
+        <w:t>-mm-</w:t>
+      </w:r>
+      <w:proofErr w:type="spellStart"/>
+      <w:r>
+        <w:rPr>
+          <w:rStyle w:val="VerbatimChar"/>
+          <w:lang w:val="es-ES"/>
+        </w:rPr>
+        <w:t>dd</w:t>
+      </w:r>
+      <w:proofErr w:type="spellEnd"/>
+      <w:r>
+        <w:rPr>
+          <w:rStyle w:val="VerbatimChar"/>
+          <w:lang w:val="es-ES"/>
+        </w:rPr>
+        <w:t xml:space="preserve"> </w:t>
+      </w:r>
+      <w:r>
+        <w:rPr>
+          <w:lang w:val="es-ES"/>
+        </w:rPr>
+        <w:t xml:space="preserve">→ </w:t>
       </w:r>
       <w:proofErr w:type="spellStart"/>
       <w:r>
@@ -8515,65 +8629,32 @@
           <w:ilvl w:val="0"/>
           <w:numId w:val="23"/>
         </w:numPr>
-        <w:rPr>
-          <w:lang w:val="es-ES"/>
-        </w:rPr>
       </w:pPr>
       <w:r>
         <w:rPr>
           <w:b/>
           <w:bCs/>
-          <w:lang w:val="es-ES"/>
         </w:rPr>
         <w:t>Trello</w:t>
       </w:r>
       <w:r>
-        <w:rPr>
-          <w:lang w:val="es-ES"/>
-        </w:rPr>
-        <w:t xml:space="preserve">: Tablero Kanban con columnas </w:t>
+        <w:t xml:space="preserve">: </w:t>
       </w:r>
       <w:proofErr w:type="spellStart"/>
       <w:r>
-        <w:rPr>
-          <w:lang w:val="es-ES"/>
-        </w:rPr>
-        <w:t>To</w:t>
+        <w:t>Tablero</w:t>
       </w:r>
       <w:proofErr w:type="spellEnd"/>
       <w:r>
-        <w:rPr>
-          <w:lang w:val="es-ES"/>
-        </w:rPr>
-        <w:t xml:space="preserve"> Do, In </w:t>
+        <w:t xml:space="preserve"> Kanban con </w:t>
       </w:r>
       <w:proofErr w:type="spellStart"/>
       <w:r>
-        <w:rPr>
-          <w:lang w:val="es-ES"/>
-        </w:rPr>
-        <w:t>Progress</w:t>
+        <w:t>columnas</w:t>
       </w:r>
       <w:proofErr w:type="spellEnd"/>
       <w:r>
-        <w:rPr>
-          <w:lang w:val="es-ES"/>
-        </w:rPr>
-        <w:t xml:space="preserve">, </w:t>
-      </w:r>
-      <w:proofErr w:type="spellStart"/>
-      <w:r>
-        <w:rPr>
-          <w:lang w:val="es-ES"/>
-        </w:rPr>
-        <w:t>Testing</w:t>
-      </w:r>
-      <w:proofErr w:type="spellEnd"/>
-      <w:r>
-        <w:rPr>
-          <w:lang w:val="es-ES"/>
-        </w:rPr>
-        <w:t xml:space="preserve">, Done. </w:t>
+        <w:t xml:space="preserve"> To Do, In Progress, Testing, Done. </w:t>
       </w:r>
     </w:p>
     <w:p>
@@ -8634,9 +8715,9 @@
       <w:pPr>
         <w:pStyle w:val="Ttulo3"/>
       </w:pPr>
-      <w:bookmarkStart w:id="30" w:name="Xf9b38a0895da7e36a65eb87a17573139bbc7a29"/>
-      <w:bookmarkStart w:id="31" w:name="metodología-de-desarrollo-elegida"/>
-      <w:bookmarkEnd w:id="31"/>
+      <w:bookmarkStart w:id="30" w:name="metodología-de-desarrollo-elegida"/>
+      <w:bookmarkStart w:id="31" w:name="Xf9b38a0895da7e36a65eb87a17573139bbc7a29"/>
+      <w:bookmarkEnd w:id="30"/>
     </w:p>
     <w:p>
       <w:pPr>
@@ -8688,6 +8769,7 @@
       <w:r>
         <w:rPr>
           <w:rStyle w:val="VerbatimChar"/>
+          <w:noProof/>
           <w:lang w:val="en-US"/>
         </w:rPr>
         <w:drawing>
@@ -9900,7 +9982,7 @@
           <w:b/>
           <w:bCs/>
           <w:sz w:val="24"/>
-          <w:lang w:val="en-US" w:eastAsia="en-US"/>
+          <w:lang w:eastAsia="en-US"/>
         </w:rPr>
       </w:pPr>
       <w:r>
@@ -11079,6 +11161,7 @@
       </w:pPr>
       <w:r>
         <w:rPr>
+          <w:noProof/>
           <w:lang w:val="es-ES"/>
         </w:rPr>
         <w:drawing>
@@ -12239,6 +12322,7 @@
       </w:pPr>
       <w:r>
         <w:rPr>
+          <w:noProof/>
           <w:u w:val="none"/>
         </w:rPr>
         <w:drawing>
@@ -13613,51 +13697,24 @@
           <w:ilvl w:val="0"/>
           <w:numId w:val="25"/>
         </w:numPr>
-        <w:rPr>
-          <w:lang w:val="es-ES"/>
-        </w:rPr>
       </w:pPr>
       <w:r>
         <w:rPr>
           <w:b/>
           <w:bCs/>
-          <w:lang w:val="es-ES"/>
         </w:rPr>
         <w:t>Tipo</w:t>
       </w:r>
       <w:r>
-        <w:rPr>
-          <w:lang w:val="es-ES"/>
-        </w:rPr>
         <w:t xml:space="preserve">: </w:t>
       </w:r>
       <w:proofErr w:type="gramStart"/>
       <w:r>
-        <w:rPr>
-          <w:lang w:val="es-ES"/>
-        </w:rPr>
         <w:t>1:N</w:t>
       </w:r>
       <w:proofErr w:type="gramEnd"/>
       <w:r>
-        <w:rPr>
-          <w:lang w:val="es-ES"/>
-        </w:rPr>
-        <w:t xml:space="preserve"> (</w:t>
-      </w:r>
-      <w:proofErr w:type="spellStart"/>
-      <w:r>
-        <w:rPr>
-          <w:lang w:val="es-ES"/>
-        </w:rPr>
-        <w:t>One-to-Many</w:t>
-      </w:r>
-      <w:proofErr w:type="spellEnd"/>
-      <w:r>
-        <w:rPr>
-          <w:lang w:val="es-ES"/>
-        </w:rPr>
-        <w:t xml:space="preserve">) </w:t>
+        <w:t xml:space="preserve"> (One-to-Many) </w:t>
       </w:r>
     </w:p>
     <w:p>
@@ -13899,6 +13956,7 @@
       <w:r>
         <w:rPr>
           <w:rStyle w:val="VerbatimChar"/>
+          <w:noProof/>
           <w:lang w:val="en-US"/>
         </w:rPr>
         <w:drawing>
@@ -13944,7 +14002,7 @@
       </w:pPr>
       <w:bookmarkStart w:id="36" w:name="base-de-datos-mongodb"/>
       <w:bookmarkStart w:id="37" w:name="_Toc230969914"/>
-      <w:bookmarkEnd w:id="30"/>
+      <w:bookmarkEnd w:id="31"/>
       <w:bookmarkEnd w:id="36"/>
       <w:r>
         <w:lastRenderedPageBreak/>
@@ -13970,6 +14028,7 @@
       <w:r>
         <w:rPr>
           <w:rStyle w:val="VerbatimChar"/>
+          <w:noProof/>
         </w:rPr>
         <w:drawing>
           <wp:inline distT="0" distB="0" distL="0" distR="0" wp14:anchorId="6AB56A9B" wp14:editId="563A370B">
@@ -14510,13 +14569,7 @@
         <w:rPr>
           <w:rStyle w:val="VerbatimChar"/>
         </w:rPr>
-        <w:t xml:space="preserve"> </w:t>
-      </w:r>
-      <w:r>
-        <w:rPr>
-          <w:rStyle w:val="VerbatimChar"/>
-        </w:rPr>
-        <w:t>│</w:t>
+        <w:t xml:space="preserve"> │</w:t>
       </w:r>
       <w:r>
         <w:br/>
@@ -15869,6 +15922,9 @@
         <w:jc w:val="center"/>
       </w:pPr>
       <w:r>
+        <w:rPr>
+          <w:noProof/>
+        </w:rPr>
         <w:drawing>
           <wp:inline distT="0" distB="0" distL="0" distR="0" wp14:anchorId="65DB955E" wp14:editId="11A201A8">
             <wp:extent cx="6293284" cy="1123950"/>
@@ -26881,23 +26937,7 @@
                 <w:rStyle w:val="NormalTok"/>
                 <w:lang w:val="en-US"/>
               </w:rPr>
-              <w:t xml:space="preserve"> </w:t>
-            </w:r>
-            <w:proofErr w:type="spellStart"/>
-            <w:r>
-              <w:rPr>
-                <w:rStyle w:val="NormalTok"/>
-                <w:lang w:val="en-US"/>
-              </w:rPr>
-              <w:t>newExp</w:t>
-            </w:r>
-            <w:proofErr w:type="spellEnd"/>
-            <w:r>
-              <w:rPr>
-                <w:rStyle w:val="NormalTok"/>
-                <w:lang w:val="en-US"/>
-              </w:rPr>
-              <w:t>])</w:t>
+              <w:t xml:space="preserve"> newExp])</w:t>
             </w:r>
             <w:r>
               <w:rPr>
@@ -27967,7 +28007,6 @@
               <w:ind w:left="240"/>
               <w:rPr>
                 <w:rStyle w:val="NormalTok"/>
-                <w:lang w:val="en-US"/>
               </w:rPr>
             </w:pPr>
             <w:bookmarkStart w:id="63" w:name="internacionalización-i18n"/>
@@ -28499,9 +28538,13 @@
           <w:color w:val="6087CC"/>
           <w:sz w:val="32"/>
           <w:szCs w:val="32"/>
-        </w:rPr>
-      </w:pPr>
-      <w:r>
+          <w:lang w:val="en-US"/>
+        </w:rPr>
+      </w:pPr>
+      <w:r>
+        <w:rPr>
+          <w:lang w:val="en-US"/>
+        </w:rPr>
         <w:br w:type="page"/>
       </w:r>
     </w:p>
@@ -29795,6 +29838,8 @@
           <w:numId w:val="13"/>
         </w:numPr>
         <w:rPr>
+          <w:i/>
+          <w:iCs/>
           <w:lang w:val="es-ES"/>
         </w:rPr>
       </w:pPr>
@@ -29820,14 +29865,32 @@
           <w:rStyle w:val="VerbatimChar"/>
           <w:lang w:val="es-ES"/>
         </w:rPr>
-        <w:t>csv-parser</w:t>
+        <w:t>csv-</w:t>
+      </w:r>
+      <w:r>
+        <w:rPr>
+          <w:rStyle w:val="VerbatimChar"/>
+          <w:i w:val="0"/>
+          <w:iCs/>
+          <w:lang w:val="es-ES"/>
+        </w:rPr>
+        <w:t>parser</w:t>
       </w:r>
       <w:proofErr w:type="spellEnd"/>
       <w:r>
         <w:rPr>
-          <w:lang w:val="es-ES"/>
-        </w:rPr>
-        <w:t xml:space="preserve"> lee el archivo como </w:t>
+          <w:rStyle w:val="VerbatimChar"/>
+          <w:i w:val="0"/>
+          <w:iCs/>
+          <w:lang w:val="es-ES"/>
+        </w:rPr>
+        <w:t xml:space="preserve"> </w:t>
+      </w:r>
+      <w:r>
+        <w:rPr>
+          <w:lang w:val="es-ES"/>
+        </w:rPr>
+        <w:t xml:space="preserve">lee el archivo como </w:t>
       </w:r>
       <w:proofErr w:type="spellStart"/>
       <w:r>
@@ -29843,26 +29906,33 @@
         </w:rPr>
         <w:t xml:space="preserve"> con </w:t>
       </w:r>
+      <w:proofErr w:type="spellStart"/>
+      <w:r>
+        <w:rPr>
+          <w:lang w:val="es-ES"/>
+        </w:rPr>
+        <w:t>auto-detección</w:t>
+      </w:r>
+      <w:proofErr w:type="spellEnd"/>
+      <w:r>
+        <w:rPr>
+          <w:lang w:val="es-ES"/>
+        </w:rPr>
+        <w:t xml:space="preserve"> de separador (; </w:t>
+      </w:r>
       <w:proofErr w:type="gramStart"/>
       <w:r>
         <w:rPr>
           <w:lang w:val="es-ES"/>
         </w:rPr>
-        <w:t xml:space="preserve">separador </w:t>
-      </w:r>
-      <w:r>
-        <w:rPr>
-          <w:rStyle w:val="VerbatimChar"/>
-          <w:lang w:val="es-ES"/>
-        </w:rPr>
-        <w:t>;</w:t>
+        <w:t>o ,</w:t>
       </w:r>
       <w:proofErr w:type="gramEnd"/>
       <w:r>
         <w:rPr>
           <w:lang w:val="es-ES"/>
         </w:rPr>
-        <w:t xml:space="preserve"> y normalización de </w:t>
+        <w:t xml:space="preserve">) y normalización de </w:t>
       </w:r>
       <w:proofErr w:type="spellStart"/>
       <w:r>
@@ -29904,7 +29974,13 @@
         <w:rPr>
           <w:lang w:val="es-ES"/>
         </w:rPr>
-        <w:t>).</w:t>
+        <w:t>)</w:t>
+      </w:r>
+      <w:r>
+        <w:rPr>
+          <w:lang w:val="es-ES"/>
+        </w:rPr>
+        <w:t>.</w:t>
       </w:r>
     </w:p>
     <w:p>
@@ -30048,12 +30124,19 @@
         <w:rPr>
           <w:lang w:val="es-ES"/>
         </w:rPr>
-        <w:t xml:space="preserve">: El formato </w:t>
+        <w:t xml:space="preserve">: </w:t>
+      </w:r>
+      <w:r>
+        <w:rPr>
+          <w:lang w:val="es-ES"/>
+        </w:rPr>
+        <w:t xml:space="preserve">Los formatos </w:t>
       </w:r>
       <w:proofErr w:type="spellStart"/>
       <w:r>
         <w:rPr>
-          <w:rStyle w:val="VerbatimChar"/>
+          <w:i/>
+          <w:iCs/>
           <w:lang w:val="es-ES"/>
         </w:rPr>
         <w:t>dd</w:t>
@@ -30061,7 +30144,8 @@
       <w:proofErr w:type="spellEnd"/>
       <w:r>
         <w:rPr>
-          <w:rStyle w:val="VerbatimChar"/>
+          <w:i/>
+          <w:iCs/>
           <w:lang w:val="es-ES"/>
         </w:rPr>
         <w:t>/mm/</w:t>
@@ -30069,7 +30153,8 @@
       <w:proofErr w:type="spellStart"/>
       <w:r>
         <w:rPr>
-          <w:rStyle w:val="VerbatimChar"/>
+          <w:i/>
+          <w:iCs/>
           <w:lang w:val="es-ES"/>
         </w:rPr>
         <w:t>yyyy</w:t>
@@ -30077,14 +30162,31 @@
       <w:proofErr w:type="spellEnd"/>
       <w:r>
         <w:rPr>
-          <w:lang w:val="es-ES"/>
-        </w:rPr>
-        <w:t xml:space="preserve"> se transforma a </w:t>
+          <w:i/>
+          <w:iCs/>
+          <w:lang w:val="es-ES"/>
+        </w:rPr>
+        <w:t xml:space="preserve"> </w:t>
+      </w:r>
+      <w:r>
+        <w:rPr>
+          <w:lang w:val="es-ES"/>
+        </w:rPr>
+        <w:t>y</w:t>
+      </w:r>
+      <w:r>
+        <w:rPr>
+          <w:i/>
+          <w:iCs/>
+          <w:lang w:val="es-ES"/>
+        </w:rPr>
+        <w:t xml:space="preserve"> </w:t>
       </w:r>
       <w:proofErr w:type="spellStart"/>
       <w:r>
         <w:rPr>
-          <w:rStyle w:val="VerbatimChar"/>
+          <w:i/>
+          <w:iCs/>
           <w:lang w:val="es-ES"/>
         </w:rPr>
         <w:t>yyyy</w:t>
@@ -30092,7 +30194,8 @@
       <w:proofErr w:type="spellEnd"/>
       <w:r>
         <w:rPr>
-          <w:rStyle w:val="VerbatimChar"/>
+          <w:i/>
+          <w:iCs/>
           <w:lang w:val="es-ES"/>
         </w:rPr>
         <w:t>-mm-</w:t>
@@ -30100,7 +30203,8 @@
       <w:proofErr w:type="spellStart"/>
       <w:r>
         <w:rPr>
-          <w:rStyle w:val="VerbatimChar"/>
+          <w:i/>
+          <w:iCs/>
           <w:lang w:val="es-ES"/>
         </w:rPr>
         <w:t>dd</w:t>
@@ -30110,20 +30214,7 @@
         <w:rPr>
           <w:lang w:val="es-ES"/>
         </w:rPr>
-        <w:t xml:space="preserve"> para compatibilidad con </w:t>
-      </w:r>
-      <w:r>
-        <w:rPr>
-          <w:rStyle w:val="VerbatimChar"/>
-          <w:lang w:val="es-ES"/>
-        </w:rPr>
-        <w:t>Date</w:t>
-      </w:r>
-      <w:r>
-        <w:rPr>
-          <w:lang w:val="es-ES"/>
-        </w:rPr>
-        <w:t xml:space="preserve"> de JavaScript.</w:t>
+        <w:t xml:space="preserve"> se transforman automáticamente al formato interno de JavaScript.</w:t>
       </w:r>
     </w:p>
     <w:p>
@@ -30154,6 +30245,1166 @@
     </w:p>
     <w:p>
       <w:pPr>
+        <w:pStyle w:val="Compact"/>
+        <w:rPr>
+          <w:lang w:val="es-ES"/>
+        </w:rPr>
+      </w:pPr>
+    </w:p>
+    <w:p>
+      <w:pPr>
+        <w:pStyle w:val="Compact"/>
+        <w:rPr>
+          <w:b/>
+          <w:bCs/>
+          <w:lang w:val="es-ES"/>
+        </w:rPr>
+      </w:pPr>
+      <w:r>
+        <w:rPr>
+          <w:b/>
+          <w:bCs/>
+          <w:lang w:val="es-ES"/>
+        </w:rPr>
+        <w:t>Especificación del formato CSV genérico esperado:</w:t>
+      </w:r>
+    </w:p>
+    <w:p>
+      <w:pPr>
+        <w:pStyle w:val="Compact"/>
+        <w:rPr>
+          <w:lang w:val="es-ES"/>
+        </w:rPr>
+      </w:pPr>
+    </w:p>
+    <w:p>
+      <w:pPr>
+        <w:pStyle w:val="Compact"/>
+        <w:rPr>
+          <w:lang w:val="es-ES"/>
+        </w:rPr>
+      </w:pPr>
+      <w:r>
+        <w:rPr>
+          <w:lang w:val="es-ES"/>
+        </w:rPr>
+        <w:t>El archivo CSV debe contener las siguientes columnas (el orden no es importante, pero los nombres deben coincidir exactamente):</w:t>
+      </w:r>
+    </w:p>
+    <w:p>
+      <w:pPr>
+        <w:pStyle w:val="Compact"/>
+        <w:rPr>
+          <w:lang w:val="es-ES"/>
+        </w:rPr>
+      </w:pPr>
+    </w:p>
+    <w:tbl>
+      <w:tblPr>
+        <w:tblStyle w:val="Tablaconcuadrcula1clara-nfasis1"/>
+        <w:tblW w:w="0" w:type="auto"/>
+        <w:tblLook w:val="04A0" w:firstRow="1" w:lastRow="0" w:firstColumn="1" w:lastColumn="0" w:noHBand="0" w:noVBand="1"/>
+      </w:tblPr>
+      <w:tblGrid>
+        <w:gridCol w:w="1353"/>
+        <w:gridCol w:w="1019"/>
+        <w:gridCol w:w="1343"/>
+        <w:gridCol w:w="3482"/>
+        <w:gridCol w:w="1819"/>
+      </w:tblGrid>
+      <w:tr>
+        <w:trPr>
+          <w:cnfStyle w:val="100000000000" w:firstRow="1" w:lastRow="0" w:firstColumn="0" w:lastColumn="0" w:oddVBand="0" w:evenVBand="0" w:oddHBand="0" w:evenHBand="0" w:firstRowFirstColumn="0" w:firstRowLastColumn="0" w:lastRowFirstColumn="0" w:lastRowLastColumn="0"/>
+        </w:trPr>
+        <w:tc>
+          <w:tcPr>
+            <w:cnfStyle w:val="001000000000" w:firstRow="0" w:lastRow="0" w:firstColumn="1" w:lastColumn="0" w:oddVBand="0" w:evenVBand="0" w:oddHBand="0" w:evenHBand="0" w:firstRowFirstColumn="0" w:firstRowLastColumn="0" w:lastRowFirstColumn="0" w:lastRowLastColumn="0"/>
+            <w:tcW w:w="0" w:type="auto"/>
+            <w:hideMark/>
+          </w:tcPr>
+          <w:p>
+            <w:pPr>
+              <w:pStyle w:val="Compact"/>
+            </w:pPr>
+            <w:r>
+              <w:lastRenderedPageBreak/>
+              <w:t>Columna</w:t>
+            </w:r>
+          </w:p>
+        </w:tc>
+        <w:tc>
+          <w:tcPr>
+            <w:tcW w:w="0" w:type="auto"/>
+            <w:hideMark/>
+          </w:tcPr>
+          <w:p>
+            <w:pPr>
+              <w:pStyle w:val="Compact"/>
+              <w:cnfStyle w:val="100000000000" w:firstRow="1" w:lastRow="0" w:firstColumn="0" w:lastColumn="0" w:oddVBand="0" w:evenVBand="0" w:oddHBand="0" w:evenHBand="0" w:firstRowFirstColumn="0" w:firstRowLastColumn="0" w:lastRowFirstColumn="0" w:lastRowLastColumn="0"/>
+            </w:pPr>
+            <w:r>
+              <w:t>Tipo</w:t>
+            </w:r>
+          </w:p>
+        </w:tc>
+        <w:tc>
+          <w:tcPr>
+            <w:tcW w:w="0" w:type="auto"/>
+            <w:hideMark/>
+          </w:tcPr>
+          <w:p>
+            <w:pPr>
+              <w:pStyle w:val="Compact"/>
+              <w:cnfStyle w:val="100000000000" w:firstRow="1" w:lastRow="0" w:firstColumn="0" w:lastColumn="0" w:oddVBand="0" w:evenVBand="0" w:oddHBand="0" w:evenHBand="0" w:firstRowFirstColumn="0" w:firstRowLastColumn="0" w:lastRowFirstColumn="0" w:lastRowLastColumn="0"/>
+            </w:pPr>
+            <w:r>
+              <w:t>Obligatorio</w:t>
+            </w:r>
+          </w:p>
+        </w:tc>
+        <w:tc>
+          <w:tcPr>
+            <w:tcW w:w="0" w:type="auto"/>
+            <w:hideMark/>
+          </w:tcPr>
+          <w:p>
+            <w:pPr>
+              <w:pStyle w:val="Compact"/>
+              <w:cnfStyle w:val="100000000000" w:firstRow="1" w:lastRow="0" w:firstColumn="0" w:lastColumn="0" w:oddVBand="0" w:evenVBand="0" w:oddHBand="0" w:evenHBand="0" w:firstRowFirstColumn="0" w:firstRowLastColumn="0" w:lastRowFirstColumn="0" w:lastRowLastColumn="0"/>
+            </w:pPr>
+            <w:r>
+              <w:t>Descripción</w:t>
+            </w:r>
+          </w:p>
+        </w:tc>
+        <w:tc>
+          <w:tcPr>
+            <w:tcW w:w="0" w:type="auto"/>
+            <w:hideMark/>
+          </w:tcPr>
+          <w:p>
+            <w:pPr>
+              <w:pStyle w:val="Compact"/>
+              <w:cnfStyle w:val="100000000000" w:firstRow="1" w:lastRow="0" w:firstColumn="0" w:lastColumn="0" w:oddVBand="0" w:evenVBand="0" w:oddHBand="0" w:evenHBand="0" w:firstRowFirstColumn="0" w:firstRowLastColumn="0" w:lastRowFirstColumn="0" w:lastRowLastColumn="0"/>
+            </w:pPr>
+            <w:r>
+              <w:t>Ejemplo</w:t>
+            </w:r>
+          </w:p>
+        </w:tc>
+      </w:tr>
+      <w:tr>
+        <w:tc>
+          <w:tcPr>
+            <w:cnfStyle w:val="001000000000" w:firstRow="0" w:lastRow="0" w:firstColumn="1" w:lastColumn="0" w:oddVBand="0" w:evenVBand="0" w:oddHBand="0" w:evenHBand="0" w:firstRowFirstColumn="0" w:firstRowLastColumn="0" w:lastRowFirstColumn="0" w:lastRowLastColumn="0"/>
+            <w:tcW w:w="0" w:type="auto"/>
+            <w:hideMark/>
+          </w:tcPr>
+          <w:p>
+            <w:pPr>
+              <w:pStyle w:val="Compact"/>
+            </w:pPr>
+            <w:proofErr w:type="spellStart"/>
+            <w:r>
+              <w:t>descripcion</w:t>
+            </w:r>
+            <w:proofErr w:type="spellEnd"/>
+          </w:p>
+        </w:tc>
+        <w:tc>
+          <w:tcPr>
+            <w:tcW w:w="0" w:type="auto"/>
+            <w:hideMark/>
+          </w:tcPr>
+          <w:p>
+            <w:pPr>
+              <w:pStyle w:val="Compact"/>
+              <w:cnfStyle w:val="000000000000" w:firstRow="0" w:lastRow="0" w:firstColumn="0" w:lastColumn="0" w:oddVBand="0" w:evenVBand="0" w:oddHBand="0" w:evenHBand="0" w:firstRowFirstColumn="0" w:firstRowLastColumn="0" w:lastRowFirstColumn="0" w:lastRowLastColumn="0"/>
+            </w:pPr>
+            <w:proofErr w:type="spellStart"/>
+            <w:r>
+              <w:t>String</w:t>
+            </w:r>
+            <w:proofErr w:type="spellEnd"/>
+          </w:p>
+        </w:tc>
+        <w:tc>
+          <w:tcPr>
+            <w:tcW w:w="0" w:type="auto"/>
+            <w:hideMark/>
+          </w:tcPr>
+          <w:p>
+            <w:pPr>
+              <w:pStyle w:val="Compact"/>
+              <w:cnfStyle w:val="000000000000" w:firstRow="0" w:lastRow="0" w:firstColumn="0" w:lastColumn="0" w:oddVBand="0" w:evenVBand="0" w:oddHBand="0" w:evenHBand="0" w:firstRowFirstColumn="0" w:firstRowLastColumn="0" w:lastRowFirstColumn="0" w:lastRowLastColumn="0"/>
+            </w:pPr>
+            <w:r>
+              <w:t>Sí</w:t>
+            </w:r>
+          </w:p>
+        </w:tc>
+        <w:tc>
+          <w:tcPr>
+            <w:tcW w:w="0" w:type="auto"/>
+            <w:hideMark/>
+          </w:tcPr>
+          <w:p>
+            <w:pPr>
+              <w:pStyle w:val="Compact"/>
+              <w:cnfStyle w:val="000000000000" w:firstRow="0" w:lastRow="0" w:firstColumn="0" w:lastColumn="0" w:oddVBand="0" w:evenVBand="0" w:oddHBand="0" w:evenHBand="0" w:firstRowFirstColumn="0" w:firstRowLastColumn="0" w:lastRowFirstColumn="0" w:lastRowLastColumn="0"/>
+            </w:pPr>
+            <w:r>
+              <w:t>Descripción del movimiento financiero</w:t>
+            </w:r>
+          </w:p>
+        </w:tc>
+        <w:tc>
+          <w:tcPr>
+            <w:tcW w:w="0" w:type="auto"/>
+            <w:hideMark/>
+          </w:tcPr>
+          <w:p>
+            <w:pPr>
+              <w:pStyle w:val="Compact"/>
+              <w:cnfStyle w:val="000000000000" w:firstRow="0" w:lastRow="0" w:firstColumn="0" w:lastColumn="0" w:oddVBand="0" w:evenVBand="0" w:oddHBand="0" w:evenHBand="0" w:firstRowFirstColumn="0" w:firstRowLastColumn="0" w:lastRowFirstColumn="0" w:lastRowLastColumn="0"/>
+            </w:pPr>
+            <w:r>
+              <w:t>“Compra en supermercado”</w:t>
+            </w:r>
+          </w:p>
+        </w:tc>
+      </w:tr>
+      <w:tr>
+        <w:tc>
+          <w:tcPr>
+            <w:cnfStyle w:val="001000000000" w:firstRow="0" w:lastRow="0" w:firstColumn="1" w:lastColumn="0" w:oddVBand="0" w:evenVBand="0" w:oddHBand="0" w:evenHBand="0" w:firstRowFirstColumn="0" w:firstRowLastColumn="0" w:lastRowFirstColumn="0" w:lastRowLastColumn="0"/>
+            <w:tcW w:w="0" w:type="auto"/>
+            <w:hideMark/>
+          </w:tcPr>
+          <w:p>
+            <w:pPr>
+              <w:pStyle w:val="Compact"/>
+            </w:pPr>
+            <w:r>
+              <w:t>cantidad</w:t>
+            </w:r>
+          </w:p>
+        </w:tc>
+        <w:tc>
+          <w:tcPr>
+            <w:tcW w:w="0" w:type="auto"/>
+            <w:hideMark/>
+          </w:tcPr>
+          <w:p>
+            <w:pPr>
+              <w:pStyle w:val="Compact"/>
+              <w:cnfStyle w:val="000000000000" w:firstRow="0" w:lastRow="0" w:firstColumn="0" w:lastColumn="0" w:oddVBand="0" w:evenVBand="0" w:oddHBand="0" w:evenHBand="0" w:firstRowFirstColumn="0" w:firstRowLastColumn="0" w:lastRowFirstColumn="0" w:lastRowLastColumn="0"/>
+            </w:pPr>
+            <w:r>
+              <w:t>Número</w:t>
+            </w:r>
+          </w:p>
+        </w:tc>
+        <w:tc>
+          <w:tcPr>
+            <w:tcW w:w="0" w:type="auto"/>
+            <w:hideMark/>
+          </w:tcPr>
+          <w:p>
+            <w:pPr>
+              <w:pStyle w:val="Compact"/>
+              <w:cnfStyle w:val="000000000000" w:firstRow="0" w:lastRow="0" w:firstColumn="0" w:lastColumn="0" w:oddVBand="0" w:evenVBand="0" w:oddHBand="0" w:evenHBand="0" w:firstRowFirstColumn="0" w:firstRowLastColumn="0" w:lastRowFirstColumn="0" w:lastRowLastColumn="0"/>
+            </w:pPr>
+            <w:r>
+              <w:t>Sí</w:t>
+            </w:r>
+          </w:p>
+        </w:tc>
+        <w:tc>
+          <w:tcPr>
+            <w:tcW w:w="0" w:type="auto"/>
+            <w:hideMark/>
+          </w:tcPr>
+          <w:p>
+            <w:pPr>
+              <w:pStyle w:val="Compact"/>
+              <w:cnfStyle w:val="000000000000" w:firstRow="0" w:lastRow="0" w:firstColumn="0" w:lastColumn="0" w:oddVBand="0" w:evenVBand="0" w:oddHBand="0" w:evenHBand="0" w:firstRowFirstColumn="0" w:firstRowLastColumn="0" w:lastRowFirstColumn="0" w:lastRowLastColumn="0"/>
+            </w:pPr>
+            <w:r>
+              <w:t>Importe del movimiento (positivo para ingresos, negativo para gastos)</w:t>
+            </w:r>
+          </w:p>
+        </w:tc>
+        <w:tc>
+          <w:tcPr>
+            <w:tcW w:w="0" w:type="auto"/>
+            <w:hideMark/>
+          </w:tcPr>
+          <w:p>
+            <w:pPr>
+              <w:pStyle w:val="Compact"/>
+              <w:cnfStyle w:val="000000000000" w:firstRow="0" w:lastRow="0" w:firstColumn="0" w:lastColumn="0" w:oddVBand="0" w:evenVBand="0" w:oddHBand="0" w:evenHBand="0" w:firstRowFirstColumn="0" w:firstRowLastColumn="0" w:lastRowFirstColumn="0" w:lastRowLastColumn="0"/>
+            </w:pPr>
+            <w:r>
+              <w:t>50.25</w:t>
+            </w:r>
+          </w:p>
+        </w:tc>
+      </w:tr>
+      <w:tr>
+        <w:tc>
+          <w:tcPr>
+            <w:cnfStyle w:val="001000000000" w:firstRow="0" w:lastRow="0" w:firstColumn="1" w:lastColumn="0" w:oddVBand="0" w:evenVBand="0" w:oddHBand="0" w:evenHBand="0" w:firstRowFirstColumn="0" w:firstRowLastColumn="0" w:lastRowFirstColumn="0" w:lastRowLastColumn="0"/>
+            <w:tcW w:w="0" w:type="auto"/>
+            <w:hideMark/>
+          </w:tcPr>
+          <w:p>
+            <w:pPr>
+              <w:pStyle w:val="Compact"/>
+            </w:pPr>
+            <w:proofErr w:type="spellStart"/>
+            <w:r>
+              <w:t>categoria</w:t>
+            </w:r>
+            <w:proofErr w:type="spellEnd"/>
+          </w:p>
+        </w:tc>
+        <w:tc>
+          <w:tcPr>
+            <w:tcW w:w="0" w:type="auto"/>
+            <w:hideMark/>
+          </w:tcPr>
+          <w:p>
+            <w:pPr>
+              <w:pStyle w:val="Compact"/>
+              <w:cnfStyle w:val="000000000000" w:firstRow="0" w:lastRow="0" w:firstColumn="0" w:lastColumn="0" w:oddVBand="0" w:evenVBand="0" w:oddHBand="0" w:evenHBand="0" w:firstRowFirstColumn="0" w:firstRowLastColumn="0" w:lastRowFirstColumn="0" w:lastRowLastColumn="0"/>
+            </w:pPr>
+            <w:proofErr w:type="spellStart"/>
+            <w:r>
+              <w:t>String</w:t>
+            </w:r>
+            <w:proofErr w:type="spellEnd"/>
+          </w:p>
+        </w:tc>
+        <w:tc>
+          <w:tcPr>
+            <w:tcW w:w="0" w:type="auto"/>
+            <w:hideMark/>
+          </w:tcPr>
+          <w:p>
+            <w:pPr>
+              <w:pStyle w:val="Compact"/>
+              <w:cnfStyle w:val="000000000000" w:firstRow="0" w:lastRow="0" w:firstColumn="0" w:lastColumn="0" w:oddVBand="0" w:evenVBand="0" w:oddHBand="0" w:evenHBand="0" w:firstRowFirstColumn="0" w:firstRowLastColumn="0" w:lastRowFirstColumn="0" w:lastRowLastColumn="0"/>
+            </w:pPr>
+            <w:r>
+              <w:t>Sí</w:t>
+            </w:r>
+          </w:p>
+        </w:tc>
+        <w:tc>
+          <w:tcPr>
+            <w:tcW w:w="0" w:type="auto"/>
+            <w:hideMark/>
+          </w:tcPr>
+          <w:p>
+            <w:pPr>
+              <w:pStyle w:val="Compact"/>
+              <w:cnfStyle w:val="000000000000" w:firstRow="0" w:lastRow="0" w:firstColumn="0" w:lastColumn="0" w:oddVBand="0" w:evenVBand="0" w:oddHBand="0" w:evenHBand="0" w:firstRowFirstColumn="0" w:firstRowLastColumn="0" w:lastRowFirstColumn="0" w:lastRowLastColumn="0"/>
+            </w:pPr>
+            <w:r>
+              <w:t>Nombre de la categoría del gasto</w:t>
+            </w:r>
+          </w:p>
+        </w:tc>
+        <w:tc>
+          <w:tcPr>
+            <w:tcW w:w="0" w:type="auto"/>
+            <w:hideMark/>
+          </w:tcPr>
+          <w:p>
+            <w:pPr>
+              <w:pStyle w:val="Compact"/>
+              <w:cnfStyle w:val="000000000000" w:firstRow="0" w:lastRow="0" w:firstColumn="0" w:lastColumn="0" w:oddVBand="0" w:evenVBand="0" w:oddHBand="0" w:evenHBand="0" w:firstRowFirstColumn="0" w:firstRowLastColumn="0" w:lastRowFirstColumn="0" w:lastRowLastColumn="0"/>
+            </w:pPr>
+            <w:r>
+              <w:t>“Alimentación”</w:t>
+            </w:r>
+          </w:p>
+        </w:tc>
+      </w:tr>
+      <w:tr>
+        <w:tc>
+          <w:tcPr>
+            <w:cnfStyle w:val="001000000000" w:firstRow="0" w:lastRow="0" w:firstColumn="1" w:lastColumn="0" w:oddVBand="0" w:evenVBand="0" w:oddHBand="0" w:evenHBand="0" w:firstRowFirstColumn="0" w:firstRowLastColumn="0" w:lastRowFirstColumn="0" w:lastRowLastColumn="0"/>
+            <w:tcW w:w="0" w:type="auto"/>
+            <w:hideMark/>
+          </w:tcPr>
+          <w:p>
+            <w:pPr>
+              <w:pStyle w:val="Compact"/>
+            </w:pPr>
+            <w:r>
+              <w:t>fecha</w:t>
+            </w:r>
+          </w:p>
+        </w:tc>
+        <w:tc>
+          <w:tcPr>
+            <w:tcW w:w="0" w:type="auto"/>
+            <w:hideMark/>
+          </w:tcPr>
+          <w:p>
+            <w:pPr>
+              <w:pStyle w:val="Compact"/>
+              <w:cnfStyle w:val="000000000000" w:firstRow="0" w:lastRow="0" w:firstColumn="0" w:lastColumn="0" w:oddVBand="0" w:evenVBand="0" w:oddHBand="0" w:evenHBand="0" w:firstRowFirstColumn="0" w:firstRowLastColumn="0" w:lastRowFirstColumn="0" w:lastRowLastColumn="0"/>
+            </w:pPr>
+            <w:r>
+              <w:t>Fecha</w:t>
+            </w:r>
+          </w:p>
+        </w:tc>
+        <w:tc>
+          <w:tcPr>
+            <w:tcW w:w="0" w:type="auto"/>
+            <w:hideMark/>
+          </w:tcPr>
+          <w:p>
+            <w:pPr>
+              <w:pStyle w:val="Compact"/>
+              <w:cnfStyle w:val="000000000000" w:firstRow="0" w:lastRow="0" w:firstColumn="0" w:lastColumn="0" w:oddVBand="0" w:evenVBand="0" w:oddHBand="0" w:evenHBand="0" w:firstRowFirstColumn="0" w:firstRowLastColumn="0" w:lastRowFirstColumn="0" w:lastRowLastColumn="0"/>
+            </w:pPr>
+            <w:r>
+              <w:t>Sí</w:t>
+            </w:r>
+          </w:p>
+        </w:tc>
+        <w:tc>
+          <w:tcPr>
+            <w:tcW w:w="0" w:type="auto"/>
+            <w:hideMark/>
+          </w:tcPr>
+          <w:p>
+            <w:pPr>
+              <w:pStyle w:val="Compact"/>
+              <w:cnfStyle w:val="000000000000" w:firstRow="0" w:lastRow="0" w:firstColumn="0" w:lastColumn="0" w:oddVBand="0" w:evenVBand="0" w:oddHBand="0" w:evenHBand="0" w:firstRowFirstColumn="0" w:firstRowLastColumn="0" w:lastRowFirstColumn="0" w:lastRowLastColumn="0"/>
+            </w:pPr>
+            <w:r>
+              <w:t>Fecha del movimiento (formato: </w:t>
+            </w:r>
+            <w:proofErr w:type="spellStart"/>
+            <w:r>
+              <w:t>dd</w:t>
+            </w:r>
+            <w:proofErr w:type="spellEnd"/>
+            <w:r>
+              <w:t>/mm/</w:t>
+            </w:r>
+            <w:proofErr w:type="spellStart"/>
+            <w:r>
+              <w:t>yyyy</w:t>
+            </w:r>
+            <w:proofErr w:type="spellEnd"/>
+            <w:r>
+              <w:t> o </w:t>
+            </w:r>
+            <w:proofErr w:type="spellStart"/>
+            <w:r>
+              <w:t>yyyy</w:t>
+            </w:r>
+            <w:proofErr w:type="spellEnd"/>
+            <w:r>
+              <w:t>-mm-</w:t>
+            </w:r>
+            <w:proofErr w:type="spellStart"/>
+            <w:r>
+              <w:t>dd</w:t>
+            </w:r>
+            <w:proofErr w:type="spellEnd"/>
+            <w:r>
+              <w:t>)</w:t>
+            </w:r>
+          </w:p>
+        </w:tc>
+        <w:tc>
+          <w:tcPr>
+            <w:tcW w:w="0" w:type="auto"/>
+            <w:hideMark/>
+          </w:tcPr>
+          <w:p>
+            <w:pPr>
+              <w:pStyle w:val="Compact"/>
+              <w:cnfStyle w:val="000000000000" w:firstRow="0" w:lastRow="0" w:firstColumn="0" w:lastColumn="0" w:oddVBand="0" w:evenVBand="0" w:oddHBand="0" w:evenHBand="0" w:firstRowFirstColumn="0" w:firstRowLastColumn="0" w:lastRowFirstColumn="0" w:lastRowLastColumn="0"/>
+            </w:pPr>
+            <w:r>
+              <w:t>“15/03/2024”</w:t>
+            </w:r>
+          </w:p>
+        </w:tc>
+      </w:tr>
+      <w:tr>
+        <w:tc>
+          <w:tcPr>
+            <w:cnfStyle w:val="001000000000" w:firstRow="0" w:lastRow="0" w:firstColumn="1" w:lastColumn="0" w:oddVBand="0" w:evenVBand="0" w:oddHBand="0" w:evenHBand="0" w:firstRowFirstColumn="0" w:firstRowLastColumn="0" w:lastRowFirstColumn="0" w:lastRowLastColumn="0"/>
+            <w:tcW w:w="0" w:type="auto"/>
+            <w:hideMark/>
+          </w:tcPr>
+          <w:p>
+            <w:pPr>
+              <w:pStyle w:val="Compact"/>
+            </w:pPr>
+            <w:r>
+              <w:t>nota</w:t>
+            </w:r>
+          </w:p>
+        </w:tc>
+        <w:tc>
+          <w:tcPr>
+            <w:tcW w:w="0" w:type="auto"/>
+            <w:hideMark/>
+          </w:tcPr>
+          <w:p>
+            <w:pPr>
+              <w:pStyle w:val="Compact"/>
+              <w:cnfStyle w:val="000000000000" w:firstRow="0" w:lastRow="0" w:firstColumn="0" w:lastColumn="0" w:oddVBand="0" w:evenVBand="0" w:oddHBand="0" w:evenHBand="0" w:firstRowFirstColumn="0" w:firstRowLastColumn="0" w:lastRowFirstColumn="0" w:lastRowLastColumn="0"/>
+            </w:pPr>
+            <w:proofErr w:type="spellStart"/>
+            <w:r>
+              <w:t>String</w:t>
+            </w:r>
+            <w:proofErr w:type="spellEnd"/>
+          </w:p>
+        </w:tc>
+        <w:tc>
+          <w:tcPr>
+            <w:tcW w:w="0" w:type="auto"/>
+            <w:hideMark/>
+          </w:tcPr>
+          <w:p>
+            <w:pPr>
+              <w:pStyle w:val="Compact"/>
+              <w:cnfStyle w:val="000000000000" w:firstRow="0" w:lastRow="0" w:firstColumn="0" w:lastColumn="0" w:oddVBand="0" w:evenVBand="0" w:oddHBand="0" w:evenHBand="0" w:firstRowFirstColumn="0" w:firstRowLastColumn="0" w:lastRowFirstColumn="0" w:lastRowLastColumn="0"/>
+            </w:pPr>
+            <w:r>
+              <w:t>No</w:t>
+            </w:r>
+          </w:p>
+        </w:tc>
+        <w:tc>
+          <w:tcPr>
+            <w:tcW w:w="0" w:type="auto"/>
+            <w:hideMark/>
+          </w:tcPr>
+          <w:p>
+            <w:pPr>
+              <w:pStyle w:val="Compact"/>
+              <w:cnfStyle w:val="000000000000" w:firstRow="0" w:lastRow="0" w:firstColumn="0" w:lastColumn="0" w:oddVBand="0" w:evenVBand="0" w:oddHBand="0" w:evenHBand="0" w:firstRowFirstColumn="0" w:firstRowLastColumn="0" w:lastRowFirstColumn="0" w:lastRowLastColumn="0"/>
+            </w:pPr>
+            <w:r>
+              <w:t>Nota adicional sobre el movimiento</w:t>
+            </w:r>
+          </w:p>
+        </w:tc>
+        <w:tc>
+          <w:tcPr>
+            <w:tcW w:w="0" w:type="auto"/>
+            <w:hideMark/>
+          </w:tcPr>
+          <w:p>
+            <w:pPr>
+              <w:pStyle w:val="Compact"/>
+              <w:cnfStyle w:val="000000000000" w:firstRow="0" w:lastRow="0" w:firstColumn="0" w:lastColumn="0" w:oddVBand="0" w:evenVBand="0" w:oddHBand="0" w:evenHBand="0" w:firstRowFirstColumn="0" w:firstRowLastColumn="0" w:lastRowFirstColumn="0" w:lastRowLastColumn="0"/>
+            </w:pPr>
+            <w:r>
+              <w:t>“Compra mensual”</w:t>
+            </w:r>
+          </w:p>
+        </w:tc>
+      </w:tr>
+      <w:tr>
+        <w:tc>
+          <w:tcPr>
+            <w:cnfStyle w:val="001000000000" w:firstRow="0" w:lastRow="0" w:firstColumn="1" w:lastColumn="0" w:oddVBand="0" w:evenVBand="0" w:oddHBand="0" w:evenHBand="0" w:firstRowFirstColumn="0" w:firstRowLastColumn="0" w:lastRowFirstColumn="0" w:lastRowLastColumn="0"/>
+            <w:tcW w:w="0" w:type="auto"/>
+            <w:hideMark/>
+          </w:tcPr>
+          <w:p>
+            <w:pPr>
+              <w:pStyle w:val="Compact"/>
+            </w:pPr>
+            <w:r>
+              <w:t>tipo</w:t>
+            </w:r>
+          </w:p>
+        </w:tc>
+        <w:tc>
+          <w:tcPr>
+            <w:tcW w:w="0" w:type="auto"/>
+            <w:hideMark/>
+          </w:tcPr>
+          <w:p>
+            <w:pPr>
+              <w:pStyle w:val="Compact"/>
+              <w:cnfStyle w:val="000000000000" w:firstRow="0" w:lastRow="0" w:firstColumn="0" w:lastColumn="0" w:oddVBand="0" w:evenVBand="0" w:oddHBand="0" w:evenHBand="0" w:firstRowFirstColumn="0" w:firstRowLastColumn="0" w:lastRowFirstColumn="0" w:lastRowLastColumn="0"/>
+            </w:pPr>
+            <w:proofErr w:type="spellStart"/>
+            <w:r>
+              <w:t>String</w:t>
+            </w:r>
+            <w:proofErr w:type="spellEnd"/>
+          </w:p>
+        </w:tc>
+        <w:tc>
+          <w:tcPr>
+            <w:tcW w:w="0" w:type="auto"/>
+            <w:hideMark/>
+          </w:tcPr>
+          <w:p>
+            <w:pPr>
+              <w:pStyle w:val="Compact"/>
+              <w:cnfStyle w:val="000000000000" w:firstRow="0" w:lastRow="0" w:firstColumn="0" w:lastColumn="0" w:oddVBand="0" w:evenVBand="0" w:oddHBand="0" w:evenHBand="0" w:firstRowFirstColumn="0" w:firstRowLastColumn="0" w:lastRowFirstColumn="0" w:lastRowLastColumn="0"/>
+            </w:pPr>
+            <w:r>
+              <w:t>No</w:t>
+            </w:r>
+          </w:p>
+        </w:tc>
+        <w:tc>
+          <w:tcPr>
+            <w:tcW w:w="0" w:type="auto"/>
+            <w:hideMark/>
+          </w:tcPr>
+          <w:p>
+            <w:pPr>
+              <w:pStyle w:val="Compact"/>
+              <w:cnfStyle w:val="000000000000" w:firstRow="0" w:lastRow="0" w:firstColumn="0" w:lastColumn="0" w:oddVBand="0" w:evenVBand="0" w:oddHBand="0" w:evenHBand="0" w:firstRowFirstColumn="0" w:firstRowLastColumn="0" w:lastRowFirstColumn="0" w:lastRowLastColumn="0"/>
+            </w:pPr>
+            <w:r>
+              <w:t>Tipo de movimiento (</w:t>
+            </w:r>
+            <w:proofErr w:type="spellStart"/>
+            <w:r>
+              <w:t>ej</w:t>
+            </w:r>
+            <w:proofErr w:type="spellEnd"/>
+            <w:r>
+              <w:t>: “gasto”, “ingreso”)</w:t>
+            </w:r>
+          </w:p>
+        </w:tc>
+        <w:tc>
+          <w:tcPr>
+            <w:tcW w:w="0" w:type="auto"/>
+            <w:hideMark/>
+          </w:tcPr>
+          <w:p>
+            <w:pPr>
+              <w:pStyle w:val="Compact"/>
+              <w:cnfStyle w:val="000000000000" w:firstRow="0" w:lastRow="0" w:firstColumn="0" w:lastColumn="0" w:oddVBand="0" w:evenVBand="0" w:oddHBand="0" w:evenHBand="0" w:firstRowFirstColumn="0" w:firstRowLastColumn="0" w:lastRowFirstColumn="0" w:lastRowLastColumn="0"/>
+            </w:pPr>
+            <w:r>
+              <w:t>“gasto”</w:t>
+            </w:r>
+          </w:p>
+        </w:tc>
+      </w:tr>
+    </w:tbl>
+    <w:p>
+      <w:pPr>
+        <w:pStyle w:val="Compact"/>
+        <w:rPr>
+          <w:lang w:val="es-ES"/>
+        </w:rPr>
+      </w:pPr>
+    </w:p>
+    <w:p>
+      <w:pPr>
+        <w:pStyle w:val="Compact"/>
+        <w:rPr>
+          <w:lang w:val="es-ES"/>
+        </w:rPr>
+      </w:pPr>
+      <w:r>
+        <w:rPr>
+          <w:b/>
+          <w:bCs/>
+          <w:lang w:val="es-ES"/>
+        </w:rPr>
+        <w:t>Ejemplo de CSV válido:</w:t>
+      </w:r>
+    </w:p>
+    <w:p>
+      <w:pPr>
+        <w:pStyle w:val="Compact"/>
+        <w:rPr>
+          <w:lang w:val="es-ES"/>
+        </w:rPr>
+      </w:pPr>
+    </w:p>
+    <w:tbl>
+      <w:tblPr>
+        <w:tblStyle w:val="Tablaconcuadrculaclara"/>
+        <w:tblW w:w="0" w:type="auto"/>
+        <w:tblLook w:val="04A0" w:firstRow="1" w:lastRow="0" w:firstColumn="1" w:lastColumn="0" w:noHBand="0" w:noVBand="1"/>
+      </w:tblPr>
+      <w:tblGrid>
+        <w:gridCol w:w="9016"/>
+      </w:tblGrid>
+      <w:tr>
+        <w:tc>
+          <w:tcPr>
+            <w:tcW w:w="9016" w:type="dxa"/>
+          </w:tcPr>
+          <w:p>
+            <w:pPr>
+              <w:pStyle w:val="Compact"/>
+              <w:rPr>
+                <w:lang w:val="es-ES"/>
+              </w:rPr>
+            </w:pPr>
+            <w:proofErr w:type="spellStart"/>
+            <w:proofErr w:type="gramStart"/>
+            <w:r>
+              <w:rPr>
+                <w:lang w:val="es-ES"/>
+              </w:rPr>
+              <w:t>descripcion,cantidad</w:t>
+            </w:r>
+            <w:proofErr w:type="gramEnd"/>
+            <w:r>
+              <w:rPr>
+                <w:lang w:val="es-ES"/>
+              </w:rPr>
+              <w:t>,categoria,fecha,nota,tipo</w:t>
+            </w:r>
+            <w:proofErr w:type="spellEnd"/>
+          </w:p>
+        </w:tc>
+      </w:tr>
+      <w:tr>
+        <w:tc>
+          <w:tcPr>
+            <w:tcW w:w="9016" w:type="dxa"/>
+          </w:tcPr>
+          <w:p>
+            <w:pPr>
+              <w:pStyle w:val="Compact"/>
+              <w:rPr>
+                <w:lang w:val="es-ES"/>
+              </w:rPr>
+            </w:pPr>
+            <w:r>
+              <w:rPr>
+                <w:lang w:val="es-ES"/>
+              </w:rPr>
+              <w:t xml:space="preserve">Compra en </w:t>
+            </w:r>
+            <w:proofErr w:type="gramStart"/>
+            <w:r>
+              <w:rPr>
+                <w:lang w:val="es-ES"/>
+              </w:rPr>
+              <w:t>supermercado,-</w:t>
+            </w:r>
+            <w:proofErr w:type="gramEnd"/>
+            <w:r>
+              <w:rPr>
+                <w:lang w:val="es-ES"/>
+              </w:rPr>
+              <w:t xml:space="preserve">45.50,Alimentación,15/03/2024,Compra </w:t>
+            </w:r>
+            <w:proofErr w:type="spellStart"/>
+            <w:r>
+              <w:rPr>
+                <w:lang w:val="es-ES"/>
+              </w:rPr>
+              <w:t>semanal,gasto</w:t>
+            </w:r>
+            <w:proofErr w:type="spellEnd"/>
+          </w:p>
+        </w:tc>
+      </w:tr>
+      <w:tr>
+        <w:tc>
+          <w:tcPr>
+            <w:tcW w:w="9016" w:type="dxa"/>
+          </w:tcPr>
+          <w:p>
+            <w:pPr>
+              <w:pStyle w:val="Compact"/>
+              <w:rPr>
+                <w:lang w:val="es-ES"/>
+              </w:rPr>
+            </w:pPr>
+            <w:r>
+              <w:rPr>
+                <w:lang w:val="es-ES"/>
+              </w:rPr>
+              <w:t>Salario mensual,2500.</w:t>
+            </w:r>
+            <w:proofErr w:type="gramStart"/>
+            <w:r>
+              <w:rPr>
+                <w:lang w:val="es-ES"/>
+              </w:rPr>
+              <w:t>00,Ingresos</w:t>
+            </w:r>
+            <w:proofErr w:type="gramEnd"/>
+            <w:r>
+              <w:rPr>
+                <w:lang w:val="es-ES"/>
+              </w:rPr>
+              <w:t xml:space="preserve">,01/03/2024,Nómina </w:t>
+            </w:r>
+            <w:proofErr w:type="spellStart"/>
+            <w:r>
+              <w:rPr>
+                <w:lang w:val="es-ES"/>
+              </w:rPr>
+              <w:t>marzo,ingreso</w:t>
+            </w:r>
+            <w:proofErr w:type="spellEnd"/>
+          </w:p>
+        </w:tc>
+      </w:tr>
+      <w:tr>
+        <w:tc>
+          <w:tcPr>
+            <w:tcW w:w="9016" w:type="dxa"/>
+          </w:tcPr>
+          <w:p>
+            <w:pPr>
+              <w:pStyle w:val="Compact"/>
+              <w:rPr>
+                <w:lang w:val="es-ES"/>
+              </w:rPr>
+            </w:pPr>
+            <w:r>
+              <w:rPr>
+                <w:lang w:val="es-ES"/>
+              </w:rPr>
+              <w:t xml:space="preserve">Taxi al </w:t>
+            </w:r>
+            <w:proofErr w:type="gramStart"/>
+            <w:r>
+              <w:rPr>
+                <w:lang w:val="es-ES"/>
+              </w:rPr>
+              <w:t>aeropuerto,-</w:t>
+            </w:r>
+            <w:proofErr w:type="gramEnd"/>
+            <w:r>
+              <w:rPr>
+                <w:lang w:val="es-ES"/>
+              </w:rPr>
+              <w:t>25.00,Transporte,10/03/2024,,gasto</w:t>
+            </w:r>
+          </w:p>
+        </w:tc>
+      </w:tr>
+      <w:tr>
+        <w:tc>
+          <w:tcPr>
+            <w:tcW w:w="9016" w:type="dxa"/>
+          </w:tcPr>
+          <w:p>
+            <w:pPr>
+              <w:pStyle w:val="Compact"/>
+              <w:rPr>
+                <w:lang w:val="es-ES"/>
+              </w:rPr>
+            </w:pPr>
+            <w:r>
+              <w:rPr>
+                <w:lang w:val="es-ES"/>
+              </w:rPr>
+              <w:t>Venta de libros usados,15.</w:t>
+            </w:r>
+            <w:proofErr w:type="gramStart"/>
+            <w:r>
+              <w:rPr>
+                <w:lang w:val="es-ES"/>
+              </w:rPr>
+              <w:t>00,Ingresos</w:t>
+            </w:r>
+            <w:proofErr w:type="gramEnd"/>
+            <w:r>
+              <w:rPr>
+                <w:lang w:val="es-ES"/>
+              </w:rPr>
+              <w:t xml:space="preserve">,12/03/2024,Plataforma </w:t>
+            </w:r>
+            <w:proofErr w:type="spellStart"/>
+            <w:r>
+              <w:rPr>
+                <w:lang w:val="es-ES"/>
+              </w:rPr>
+              <w:t>online,ingreso</w:t>
+            </w:r>
+            <w:proofErr w:type="spellEnd"/>
+          </w:p>
+        </w:tc>
+      </w:tr>
+    </w:tbl>
+    <w:p>
+      <w:pPr>
+        <w:pStyle w:val="Compact"/>
+        <w:rPr>
+          <w:lang w:val="es-ES"/>
+        </w:rPr>
+      </w:pPr>
+    </w:p>
+    <w:p>
+      <w:pPr>
+        <w:pStyle w:val="Compact"/>
+        <w:rPr>
+          <w:b/>
+          <w:bCs/>
+          <w:lang w:val="es-ES"/>
+        </w:rPr>
+      </w:pPr>
+      <w:r>
+        <w:rPr>
+          <w:b/>
+          <w:bCs/>
+          <w:lang w:val="es-ES"/>
+        </w:rPr>
+        <w:t>Notas importantes:</w:t>
+      </w:r>
+    </w:p>
+    <w:p>
+      <w:pPr>
+        <w:pStyle w:val="Compact"/>
+        <w:numPr>
+          <w:ilvl w:val="0"/>
+          <w:numId w:val="28"/>
+        </w:numPr>
+        <w:rPr>
+          <w:lang w:val="es-ES"/>
+        </w:rPr>
+      </w:pPr>
+      <w:r>
+        <w:rPr>
+          <w:lang w:val="es-ES"/>
+        </w:rPr>
+        <w:t xml:space="preserve">Los separadores soportados </w:t>
+      </w:r>
+      <w:proofErr w:type="gramStart"/>
+      <w:r>
+        <w:rPr>
+          <w:lang w:val="es-ES"/>
+        </w:rPr>
+        <w:t>son ;</w:t>
+      </w:r>
+      <w:proofErr w:type="gramEnd"/>
+      <w:r>
+        <w:rPr>
+          <w:lang w:val="es-ES"/>
+        </w:rPr>
+        <w:t xml:space="preserve"> (punto y coma) y , (coma).</w:t>
+      </w:r>
+    </w:p>
+    <w:p>
+      <w:pPr>
+        <w:pStyle w:val="Compact"/>
+        <w:numPr>
+          <w:ilvl w:val="0"/>
+          <w:numId w:val="28"/>
+        </w:numPr>
+        <w:rPr>
+          <w:lang w:val="es-ES"/>
+        </w:rPr>
+      </w:pPr>
+      <w:r>
+        <w:rPr>
+          <w:lang w:val="es-ES"/>
+        </w:rPr>
+        <w:t xml:space="preserve">Las columnas obligatorias son: </w:t>
+      </w:r>
+      <w:proofErr w:type="spellStart"/>
+      <w:r>
+        <w:rPr>
+          <w:lang w:val="es-ES"/>
+        </w:rPr>
+        <w:t>descripcion</w:t>
+      </w:r>
+      <w:proofErr w:type="spellEnd"/>
+      <w:r>
+        <w:rPr>
+          <w:lang w:val="es-ES"/>
+        </w:rPr>
+        <w:t xml:space="preserve">, cantidad, </w:t>
+      </w:r>
+      <w:proofErr w:type="spellStart"/>
+      <w:r>
+        <w:rPr>
+          <w:lang w:val="es-ES"/>
+        </w:rPr>
+        <w:t>categoria</w:t>
+      </w:r>
+      <w:proofErr w:type="spellEnd"/>
+      <w:r>
+        <w:rPr>
+          <w:lang w:val="es-ES"/>
+        </w:rPr>
+        <w:t>, fecha.</w:t>
+      </w:r>
+    </w:p>
+    <w:p>
+      <w:pPr>
+        <w:pStyle w:val="Compact"/>
+        <w:numPr>
+          <w:ilvl w:val="0"/>
+          <w:numId w:val="28"/>
+        </w:numPr>
+        <w:rPr>
+          <w:lang w:val="es-ES"/>
+        </w:rPr>
+      </w:pPr>
+      <w:r>
+        <w:rPr>
+          <w:lang w:val="es-ES"/>
+        </w:rPr>
+        <w:t>Las columnas nota y tipo son opcionales.</w:t>
+      </w:r>
+    </w:p>
+    <w:p>
+      <w:pPr>
+        <w:pStyle w:val="Compact"/>
+        <w:numPr>
+          <w:ilvl w:val="0"/>
+          <w:numId w:val="28"/>
+        </w:numPr>
+        <w:rPr>
+          <w:lang w:val="es-ES"/>
+        </w:rPr>
+      </w:pPr>
+      <w:r>
+        <w:rPr>
+          <w:lang w:val="es-ES"/>
+        </w:rPr>
+        <w:t>Las cantidades pueden ser positivas (ingresos) o negativas (gastos).</w:t>
+      </w:r>
+    </w:p>
+    <w:p>
+      <w:pPr>
+        <w:pStyle w:val="Compact"/>
+        <w:numPr>
+          <w:ilvl w:val="0"/>
+          <w:numId w:val="28"/>
+        </w:numPr>
+        <w:rPr>
+          <w:lang w:val="es-ES"/>
+        </w:rPr>
+      </w:pPr>
+      <w:r>
+        <w:rPr>
+          <w:lang w:val="es-ES"/>
+        </w:rPr>
+        <w:t xml:space="preserve">Los formatos de fecha soportados son: </w:t>
+      </w:r>
+      <w:proofErr w:type="spellStart"/>
+      <w:r>
+        <w:rPr>
+          <w:lang w:val="es-ES"/>
+        </w:rPr>
+        <w:t>dd</w:t>
+      </w:r>
+      <w:proofErr w:type="spellEnd"/>
+      <w:r>
+        <w:rPr>
+          <w:lang w:val="es-ES"/>
+        </w:rPr>
+        <w:t>/mm/</w:t>
+      </w:r>
+      <w:proofErr w:type="spellStart"/>
+      <w:r>
+        <w:rPr>
+          <w:lang w:val="es-ES"/>
+        </w:rPr>
+        <w:t>yyyy</w:t>
+      </w:r>
+      <w:proofErr w:type="spellEnd"/>
+      <w:r>
+        <w:rPr>
+          <w:lang w:val="es-ES"/>
+        </w:rPr>
+        <w:t xml:space="preserve"> y </w:t>
+      </w:r>
+      <w:proofErr w:type="spellStart"/>
+      <w:r>
+        <w:rPr>
+          <w:lang w:val="es-ES"/>
+        </w:rPr>
+        <w:t>yyyy</w:t>
+      </w:r>
+      <w:proofErr w:type="spellEnd"/>
+      <w:r>
+        <w:rPr>
+          <w:lang w:val="es-ES"/>
+        </w:rPr>
+        <w:t>-mm-</w:t>
+      </w:r>
+      <w:proofErr w:type="spellStart"/>
+      <w:r>
+        <w:rPr>
+          <w:lang w:val="es-ES"/>
+        </w:rPr>
+        <w:t>dd</w:t>
+      </w:r>
+      <w:proofErr w:type="spellEnd"/>
+      <w:r>
+        <w:rPr>
+          <w:lang w:val="es-ES"/>
+        </w:rPr>
+        <w:t>.</w:t>
+      </w:r>
+    </w:p>
+    <w:p>
+      <w:pPr>
+        <w:pStyle w:val="Compact"/>
+        <w:numPr>
+          <w:ilvl w:val="0"/>
+          <w:numId w:val="28"/>
+        </w:numPr>
+        <w:rPr>
+          <w:lang w:val="es-ES"/>
+        </w:rPr>
+      </w:pPr>
+      <w:r>
+        <w:rPr>
+          <w:lang w:val="es-ES"/>
+        </w:rPr>
+        <w:t>Si se importa una categoría que no existe, se creará automáticamente en la base de datos.</w:t>
+      </w:r>
+    </w:p>
+    <w:p>
+      <w:pPr>
+        <w:pStyle w:val="Compact"/>
+        <w:numPr>
+          <w:ilvl w:val="0"/>
+          <w:numId w:val="28"/>
+        </w:numPr>
+        <w:rPr>
+          <w:lang w:val="es-ES"/>
+        </w:rPr>
+      </w:pPr>
+      <w:r>
+        <w:rPr>
+          <w:lang w:val="es-ES"/>
+        </w:rPr>
+        <w:t>Las filas con datos inválidos o campos obligatorios vacíos serán ignoradas durante la importación.</w:t>
+      </w:r>
+    </w:p>
+    <w:p>
+      <w:pPr>
+        <w:pStyle w:val="Compact"/>
+        <w:rPr>
+          <w:lang w:val="es-ES"/>
+        </w:rPr>
+      </w:pPr>
+    </w:p>
+    <w:p>
+      <w:pPr>
         <w:pStyle w:val="Ttulo4"/>
       </w:pPr>
       <w:bookmarkStart w:id="67" w:name="importación-bbva"/>
@@ -30240,12 +31491,27 @@
     </w:p>
     <w:p>
       <w:pPr>
-        <w:pStyle w:val="Ttulo3"/>
+        <w:rPr>
+          <w:rFonts w:ascii="Cambria" w:hAnsi="Cambria"/>
+          <w:b/>
+          <w:bCs/>
+          <w:color w:val="6087CC"/>
+          <w:sz w:val="32"/>
+          <w:szCs w:val="32"/>
+        </w:rPr>
       </w:pPr>
       <w:bookmarkStart w:id="69" w:name="importación-y-exportación-de-datos-csv"/>
       <w:bookmarkStart w:id="70" w:name="_Toc230969925"/>
       <w:bookmarkEnd w:id="68"/>
       <w:bookmarkEnd w:id="69"/>
+      <w:r>
+        <w:br w:type="page"/>
+      </w:r>
+    </w:p>
+    <w:p>
+      <w:pPr>
+        <w:pStyle w:val="Ttulo3"/>
+      </w:pPr>
       <w:r>
         <w:lastRenderedPageBreak/>
         <w:t xml:space="preserve">5.8 </w:t>
@@ -31090,7 +32356,6 @@
         <w:rPr>
           <w:b/>
           <w:bCs/>
-          <w:lang w:val="es-ES"/>
         </w:rPr>
       </w:pPr>
     </w:p>
@@ -31945,7 +33210,7 @@
       </w:pPr>
       <w:r>
         <w:pict w14:anchorId="2F964651">
-          <v:rect id="_x0000_i1098" style="width:441.9pt;height:1.5pt" o:hralign="center" o:hrstd="t" o:hr="t" fillcolor="#a0a0a0" stroked="f"/>
+          <v:rect id="_x0000_i1029" style="width:441.9pt;height:1.5pt" o:hralign="center" o:hrstd="t" o:hr="t" fillcolor="#a0a0a0" stroked="f"/>
         </w:pict>
       </w:r>
     </w:p>
@@ -33496,9 +34761,19 @@
       <w:pPr>
         <w:jc w:val="center"/>
       </w:pPr>
+    </w:p>
+    <w:p>
+      <w:pPr>
+        <w:jc w:val="center"/>
+      </w:pPr>
+    </w:p>
+    <w:p>
+      <w:pPr>
+        <w:jc w:val="center"/>
+      </w:pPr>
       <w:r>
         <w:pict w14:anchorId="33144D4B">
-          <v:rect id="_x0000_i1099" style="width:441.9pt;height:1.5pt" o:hralign="center" o:hrstd="t" o:hr="t" fillcolor="#a0a0a0" stroked="f"/>
+          <v:rect id="_x0000_i1030" style="width:441.9pt;height:1.5pt" o:hralign="center" o:hrstd="t" o:hr="t" fillcolor="#a0a0a0" stroked="f"/>
         </w:pict>
       </w:r>
     </w:p>
@@ -33852,6 +35127,9 @@
     <w:p>
       <w:pPr>
         <w:pStyle w:val="Ttulo4"/>
+        <w:rPr>
+          <w:lang w:val="en-US"/>
+        </w:rPr>
       </w:pPr>
       <w:bookmarkStart w:id="86" w:name="referencias-técnicas-principales"/>
       <w:bookmarkStart w:id="87" w:name="metodología"/>
@@ -33896,6 +35174,9 @@
     <w:p>
       <w:pPr>
         <w:pStyle w:val="Ttulo4"/>
+        <w:rPr>
+          <w:lang w:val="en-US"/>
+        </w:rPr>
       </w:pPr>
     </w:p>
     <w:p>
@@ -34705,6 +35986,119 @@
     </w:lvl>
   </w:abstractNum>
   <w:abstractNum w:abstractNumId="5" w15:restartNumberingAfterBreak="0">
+    <w:nsid w:val="5C3E0E22"/>
+    <w:multiLevelType w:val="hybridMultilevel"/>
+    <w:tmpl w:val="BC94F82E"/>
+    <w:lvl w:ilvl="0" w:tplc="0C0A0001">
+      <w:start w:val="1"/>
+      <w:numFmt w:val="bullet"/>
+      <w:lvlText w:val=""/>
+      <w:lvlJc w:val="left"/>
+      <w:pPr>
+        <w:ind w:left="720" w:hanging="360"/>
+      </w:pPr>
+      <w:rPr>
+        <w:rFonts w:ascii="Symbol" w:hAnsi="Symbol" w:hint="default"/>
+      </w:rPr>
+    </w:lvl>
+    <w:lvl w:ilvl="1" w:tplc="0C0A0003" w:tentative="1">
+      <w:start w:val="1"/>
+      <w:numFmt w:val="bullet"/>
+      <w:lvlText w:val="o"/>
+      <w:lvlJc w:val="left"/>
+      <w:pPr>
+        <w:ind w:left="1440" w:hanging="360"/>
+      </w:pPr>
+      <w:rPr>
+        <w:rFonts w:ascii="Courier New" w:hAnsi="Courier New" w:cs="Courier New" w:hint="default"/>
+      </w:rPr>
+    </w:lvl>
+    <w:lvl w:ilvl="2" w:tplc="0C0A0005" w:tentative="1">
+      <w:start w:val="1"/>
+      <w:numFmt w:val="bullet"/>
+      <w:lvlText w:val=""/>
+      <w:lvlJc w:val="left"/>
+      <w:pPr>
+        <w:ind w:left="2160" w:hanging="360"/>
+      </w:pPr>
+      <w:rPr>
+        <w:rFonts w:ascii="Wingdings" w:hAnsi="Wingdings" w:hint="default"/>
+      </w:rPr>
+    </w:lvl>
+    <w:lvl w:ilvl="3" w:tplc="0C0A0001" w:tentative="1">
+      <w:start w:val="1"/>
+      <w:numFmt w:val="bullet"/>
+      <w:lvlText w:val=""/>
+      <w:lvlJc w:val="left"/>
+      <w:pPr>
+        <w:ind w:left="2880" w:hanging="360"/>
+      </w:pPr>
+      <w:rPr>
+        <w:rFonts w:ascii="Symbol" w:hAnsi="Symbol" w:hint="default"/>
+      </w:rPr>
+    </w:lvl>
+    <w:lvl w:ilvl="4" w:tplc="0C0A0003" w:tentative="1">
+      <w:start w:val="1"/>
+      <w:numFmt w:val="bullet"/>
+      <w:lvlText w:val="o"/>
+      <w:lvlJc w:val="left"/>
+      <w:pPr>
+        <w:ind w:left="3600" w:hanging="360"/>
+      </w:pPr>
+      <w:rPr>
+        <w:rFonts w:ascii="Courier New" w:hAnsi="Courier New" w:cs="Courier New" w:hint="default"/>
+      </w:rPr>
+    </w:lvl>
+    <w:lvl w:ilvl="5" w:tplc="0C0A0005" w:tentative="1">
+      <w:start w:val="1"/>
+      <w:numFmt w:val="bullet"/>
+      <w:lvlText w:val=""/>
+      <w:lvlJc w:val="left"/>
+      <w:pPr>
+        <w:ind w:left="4320" w:hanging="360"/>
+      </w:pPr>
+      <w:rPr>
+        <w:rFonts w:ascii="Wingdings" w:hAnsi="Wingdings" w:hint="default"/>
+      </w:rPr>
+    </w:lvl>
+    <w:lvl w:ilvl="6" w:tplc="0C0A0001" w:tentative="1">
+      <w:start w:val="1"/>
+      <w:numFmt w:val="bullet"/>
+      <w:lvlText w:val=""/>
+      <w:lvlJc w:val="left"/>
+      <w:pPr>
+        <w:ind w:left="5040" w:hanging="360"/>
+      </w:pPr>
+      <w:rPr>
+        <w:rFonts w:ascii="Symbol" w:hAnsi="Symbol" w:hint="default"/>
+      </w:rPr>
+    </w:lvl>
+    <w:lvl w:ilvl="7" w:tplc="0C0A0003" w:tentative="1">
+      <w:start w:val="1"/>
+      <w:numFmt w:val="bullet"/>
+      <w:lvlText w:val="o"/>
+      <w:lvlJc w:val="left"/>
+      <w:pPr>
+        <w:ind w:left="5760" w:hanging="360"/>
+      </w:pPr>
+      <w:rPr>
+        <w:rFonts w:ascii="Courier New" w:hAnsi="Courier New" w:cs="Courier New" w:hint="default"/>
+      </w:rPr>
+    </w:lvl>
+    <w:lvl w:ilvl="8" w:tplc="0C0A0005" w:tentative="1">
+      <w:start w:val="1"/>
+      <w:numFmt w:val="bullet"/>
+      <w:lvlText w:val=""/>
+      <w:lvlJc w:val="left"/>
+      <w:pPr>
+        <w:ind w:left="6480" w:hanging="360"/>
+      </w:pPr>
+      <w:rPr>
+        <w:rFonts w:ascii="Wingdings" w:hAnsi="Wingdings" w:hint="default"/>
+      </w:rPr>
+    </w:lvl>
+  </w:abstractNum>
+  <w:abstractNum w:abstractNumId="6" w15:restartNumberingAfterBreak="0">
     <w:nsid w:val="5D0A1DCA"/>
     <w:multiLevelType w:val="hybridMultilevel"/>
     <w:tmpl w:val="E1D06D76"/>
@@ -34817,7 +36211,7 @@
       </w:rPr>
     </w:lvl>
   </w:abstractNum>
-  <w:abstractNum w:abstractNumId="6" w15:restartNumberingAfterBreak="0">
+  <w:abstractNum w:abstractNumId="7" w15:restartNumberingAfterBreak="0">
     <w:nsid w:val="63823296"/>
     <w:multiLevelType w:val="hybridMultilevel"/>
     <w:tmpl w:val="E7BA8DD8"/>
@@ -34930,7 +36324,7 @@
       </w:rPr>
     </w:lvl>
   </w:abstractNum>
-  <w:abstractNum w:abstractNumId="7" w15:restartNumberingAfterBreak="0">
+  <w:abstractNum w:abstractNumId="8" w15:restartNumberingAfterBreak="0">
     <w:nsid w:val="6F636D5C"/>
     <w:multiLevelType w:val="hybridMultilevel"/>
     <w:tmpl w:val="876CA1BA"/>
@@ -35043,7 +36437,7 @@
       </w:rPr>
     </w:lvl>
   </w:abstractNum>
-  <w:abstractNum w:abstractNumId="8" w15:restartNumberingAfterBreak="0">
+  <w:abstractNum w:abstractNumId="9" w15:restartNumberingAfterBreak="0">
     <w:nsid w:val="752732B0"/>
     <w:multiLevelType w:val="hybridMultilevel"/>
     <w:tmpl w:val="8CD2E020"/>
@@ -35173,15 +36567,6 @@
   </w:num>
   <w:num w:numId="5">
     <w:abstractNumId w:val="0"/>
-    <w:lvlOverride w:ilvl="0"/>
-    <w:lvlOverride w:ilvl="1"/>
-    <w:lvlOverride w:ilvl="2"/>
-    <w:lvlOverride w:ilvl="3"/>
-    <w:lvlOverride w:ilvl="4"/>
-    <w:lvlOverride w:ilvl="5"/>
-    <w:lvlOverride w:ilvl="6"/>
-    <w:lvlOverride w:ilvl="7"/>
-    <w:lvlOverride w:ilvl="8"/>
   </w:num>
   <w:num w:numId="6">
     <w:abstractNumId w:val="1"/>
@@ -35667,19 +37052,22 @@
     </w:lvlOverride>
   </w:num>
   <w:num w:numId="23">
-    <w:abstractNumId w:val="8"/>
+    <w:abstractNumId w:val="9"/>
   </w:num>
   <w:num w:numId="24">
     <w:abstractNumId w:val="3"/>
   </w:num>
   <w:num w:numId="25">
-    <w:abstractNumId w:val="5"/>
+    <w:abstractNumId w:val="6"/>
   </w:num>
   <w:num w:numId="26">
+    <w:abstractNumId w:val="8"/>
+  </w:num>
+  <w:num w:numId="27">
     <w:abstractNumId w:val="7"/>
   </w:num>
-  <w:num w:numId="27">
-    <w:abstractNumId w:val="6"/>
+  <w:num w:numId="28">
+    <w:abstractNumId w:val="5"/>
   </w:num>
 </w:numbering>
 </file>
@@ -36264,6 +37652,7 @@
   <w:style w:type="character" w:default="1" w:styleId="Fuentedeprrafopredeter">
     <w:name w:val="Default Paragraph Font"/>
     <w:uiPriority w:val="1"/>
+    <w:semiHidden/>
     <w:unhideWhenUsed/>
   </w:style>
   <w:style w:type="table" w:default="1" w:styleId="Tablanormal">
@@ -37250,6 +38639,8 @@
     </w:pPr>
     <w:rPr>
       <w:rFonts w:asciiTheme="minorHAnsi" w:eastAsiaTheme="minorHAnsi" w:hAnsiTheme="minorHAnsi" w:cstheme="minorBidi"/>
+      <w:sz w:val="20"/>
+      <w:szCs w:val="20"/>
       <w:lang w:val="en-US" w:eastAsia="en-US"/>
     </w:rPr>
     <w:tblPr>
@@ -37412,6 +38803,19 @@
     <w:tcPr>
       <w:shd w:val="clear" w:color="auto" w:fill="F2F2F2" w:themeFill="background1" w:themeFillShade="F2"/>
     </w:tcPr>
+  </w:style>
+  <w:style w:type="character" w:styleId="CdigoHTML">
+    <w:name w:val="HTML Code"/>
+    <w:basedOn w:val="Fuentedeprrafopredeter"/>
+    <w:uiPriority w:val="99"/>
+    <w:semiHidden/>
+    <w:unhideWhenUsed/>
+    <w:rsid w:val="00230E75"/>
+    <w:rPr>
+      <w:rFonts w:ascii="Courier New" w:eastAsia="Times New Roman" w:hAnsi="Courier New" w:cs="Courier New"/>
+      <w:sz w:val="20"/>
+      <w:szCs w:val="20"/>
+    </w:rPr>
   </w:style>
 </w:styles>
 </file>

</xml_diff>